<commit_message>
Update to incorporate FIE's 9/1 submition
</commit_message>
<xml_diff>
--- a/Filings/Discovery/discoveryPlanAndInformationalStatement/Plaintiffs_Rule_26.06_Discovery_Plan_V5.docx
+++ b/Filings/Discovery/discoveryPlanAndInformationalStatement/Plaintiffs_Rule_26.06_Discovery_Plan_V5.docx
@@ -276,7 +276,7 @@
         <w:t>Scope of the parties' disagreement.</w:t>
       </w:r>
       <w:r>
-        <w:t xml:space="preserve">  Defendant's letter to the Court of August 28, 2026 describes the parties as having had “significantly different positions on proposed dates for the Scheduling Order.” Plaintiffs respectfully note that the disagreement is not confined to dates. The parties agree on the matter stated in paragraph 1, and substantially agree on paragraph 5. Before and during the conference, Plaintiffs also proposed substantive terms governing the form of production for electronically stored information (paragraph 3), the procedure for claims of privilege (paragraph 4), and a protective order (paragraph 6) — subjects on which Defendant's August 27, 2026 draft is silent or states only that the Rules will be followed. Plaintiffs set out those proposed terms below so that they may be addressed in the Court's Scheduling Order.</w:t>
+        <w:t xml:space="preserve">  Defendant's letter to the Court of August 28, 2026 describes the parties as having had “significantly different positions on proposed dates for the Scheduling Order.” The disagreement is not confined to dates. The parties do agree that no change is needed to the timing or form of initial disclosures (paragraph 1) and that no limitations beyond those in the Rules should be imposed (paragraph 5). Before and during the conference, Plaintiffs also proposed substantive terms governing the form of production for electronically stored information (paragraph 3), the procedure for claims of privilege (paragraph 4), and a protective order (paragraph 6). Defendant's Proposed Rule 26.06 Discovery Plan, filed September 1, 2026, does not adopt those terms: its corresponding paragraphs provide only that the parties will retain discoverable material and will follow Rule 26, and it contains no confidentiality provision. Because Defendant's plan states those paragraphs in the joint voice, Plaintiffs respectfully clarify that they have not agreed to the terms stated in paragraphs 3 and 4 of Defendant's plan, or to the deadlines in its paragraph 6. Plaintiffs set out their proposed terms below so that they may be addressed in the Court's Scheduling Order.</w:t>
       </w:r>
     </w:p>
     <w:p>
@@ -291,6 +291,7 @@
         <w:rPr>
           <w:b/>
         </w:rPr>
+        <w:lastRenderedPageBreak/>
         <w:t>1.</w:t>
       </w:r>
       <w:r>
@@ -330,11 +331,7 @@
         <w:t>Subjects on which discovery may be needed; when discovery should be completed; whether discovery should be in phases.</w:t>
       </w:r>
       <w:r>
-        <w:t xml:space="preserve">  Discovery will be needed on Plaintiffs' claims and Defendant's defenses. Discovery should not be conducted in phases or limited to </w:t>
-      </w:r>
-      <w:r>
-        <w:lastRenderedPageBreak/>
-        <w:t>particular issues, and fact discovery should precede expert discovery on the schedule set out in paragraph 7. The subjects include:</w:t>
+        <w:t xml:space="preserve">  Discovery will be needed on Plaintiffs' claims and Defendant's defenses. Discovery should not be conducted in phases or limited to particular issues, and fact discovery should precede expert discovery on the schedule set out in paragraph 7. The subjects include:</w:t>
       </w:r>
     </w:p>
     <w:p>
@@ -479,11 +476,11 @@
         <w:t>Basis for the proposed fact-discovery period.</w:t>
       </w:r>
       <w:r>
-        <w:t xml:space="preserve">  This is a document-intensive first-party insurance case: a multi-year claim file spanning two claims, three separate inspections by two outside firms, non-party discovery from those firms and from the members of the appraisal panel, and competing expert causation testimony. The claim file also contains unresolved factual gaps. Defendant has not identified the damage locations from the 2020 claim on which its prior-payment position depends. Defendant has given two irreconcilable accounts of the September 6, 2024 inspection conducted by its own adjuster, stating on October 10, 2025 that “[t]he file does not contain a report on the requested date” and on October 29, 2025 that “[a]ll the information we can release has already been sent to you.” And Defendant has not consistently identified which windows the September 12, 2025 appraisal award covers — an award that designates them only by the undefined codes “F 1.7” and “B 1.2.” Resolving each of these requires written discovery, a documented custodial search, and, as to the missing inspection record, an </w:t>
+        <w:t xml:space="preserve">  This is a document-intensive first-party insurance case: a multi-year claim file spanning two claims, three separate inspections by two outside firms, non-party discovery from those firms and from the members of the appraisal panel, and competing expert causation testimony. The claim file also contains unresolved factual gaps. Defendant has not identified the damage locations from the 2020 claim on which its prior-payment position depends. Defendant has given two irreconcilable accounts of the September 6, 2024 inspection conducted by its own adjuster, stating on October 10, 2025 that “[t]he file does not contain a report on the </w:t>
       </w:r>
       <w:r>
         <w:lastRenderedPageBreak/>
-        <w:t>organizational deposition under Rule 30.02(f) that cannot be scheduled until that search is complete.</w:t>
+        <w:t>requested date” and on October 29, 2025 that “[a]ll the information we can release has already been sent to you.” And Defendant has not consistently identified which windows the September 12, 2025 appraisal award covers — an award that designates them only by the undefined codes “F 1.7” and “B 1.2.” Resolving each of these requires written discovery, a documented custodial search, and, as to the missing inspection record, an organizational deposition under Rule 30.02(f) that cannot be scheduled until that search is complete.</w:t>
       </w:r>
     </w:p>
     <w:p>
@@ -618,11 +615,11 @@
         <w:ind w:left="1080"/>
       </w:pPr>
       <w:r>
-        <w:t xml:space="preserve">(c)  Material designated CONFIDENTIAL may be disclosed to: the parties; the Court and its personnel; court reporters and videographers; any person retained by a party as an expert or consultant in this action; Jeffrey Hu, who assists Plaintiffs in preparing this litigation and whose access the parties discussed at the conference; deposition and trial witnesses to the extent reasonably necessary for their examination; and, as to Defendant, its counsel of record, counsel's staff, and its employees and representatives with a need to know. Each such person, other than the parties, the </w:t>
+        <w:t xml:space="preserve">(c)  Material designated CONFIDENTIAL may be disclosed to: the parties; the Court and its personnel; court reporters and videographers; any person retained by a party as </w:t>
       </w:r>
       <w:r>
         <w:lastRenderedPageBreak/>
-        <w:t>Court and its personnel, and counsel of record and counsel's staff, shall first sign a written undertaking agreeing to be bound by the order and submitting to the jurisdiction of this Court for its enforcement.</w:t>
+        <w:t>an expert or consultant in this action; Jeffrey Hu, who assists Plaintiffs in preparing this litigation and whose access the parties discussed at the conference; deposition and trial witnesses to the extent reasonably necessary for their examination; and, as to Defendant, its counsel of record, counsel's staff, and its employees and representatives with a need to know. Each such person, other than the parties, the Court and its personnel, and counsel of record and counsel's staff, shall first sign a written undertaking agreeing to be bound by the order and submitting to the jurisdiction of this Court for its enforcement.</w:t>
       </w:r>
     </w:p>
     <w:p>
@@ -1168,7 +1165,11 @@
         <w:t>Note on the trial-ready date proposed here.</w:t>
       </w:r>
       <w:r>
-        <w:t xml:space="preserve">  At the Rule 26.06 conference on August 28, 2026, Plaintiffs proposed a trial-ready date in June 2028. The schedule proposed above advances that date to May 15, 2028. Plaintiffs have shortened their own proposal by removing intervals that the work of this case does not require — principally by scheduling alternative dispute resolution after the exchange of expert reports rather than ahead of them, and by shortening each expert disclosure round to approximately one month. Plaintiffs have accordingly moved toward Defendant's position, and respectfully submit that the schedule above is the shortest one consistent with completing the discovery this case requires.</w:t>
+        <w:t xml:space="preserve">  At the Rule 26.06 conference on August 28, 2026, Plaintiffs proposed a trial-ready date in June 2028. The schedule proposed above advances that date to May 15, 2028. Plaintiffs have shortened their own proposal by removing intervals that the work of this case does not require — principally by scheduling alternative dispute resolution after the exchange of expert reports rather than ahead of them, and by shortening each expert disclosure round to approximately one month. Plaintiffs have accordingly moved toward Defendant's position, and respectfully </w:t>
+      </w:r>
+      <w:r>
+        <w:lastRenderedPageBreak/>
+        <w:t>submit that the schedule above is the shortest one consistent with completing the discovery this case requires.</w:t>
       </w:r>
     </w:p>
     <w:p>
@@ -1195,7 +1196,6 @@
         <w:rPr>
           <w:b/>
         </w:rPr>
-        <w:lastRenderedPageBreak/>
         <w:t>Note on the deadline to join parties and amend pleadings.</w:t>
       </w:r>
       <w:r>
@@ -1256,17 +1256,12 @@
         <w:rPr>
           <w:b/>
         </w:rPr>
+        <w:lastRenderedPageBreak/>
         <w:t>Note on the trial-ready date.</w:t>
       </w:r>
       <w:r>
         <w:t xml:space="preserve">  Plaintiffs propose a fixed trial-ready date rather than one expressed by reference to the determination of a dispositive motion. If a dispositive motion remains under advisement as the trial-ready date approaches, the parties will address the trial setting with the Court.</w:t>
       </w:r>
-    </w:p>
-    <w:p>
-      <w:pPr>
-        <w:spacing w:after="160"/>
-        <w:ind w:left="720"/>
-      </w:pPr>
     </w:p>
     <w:p>
       <w:pPr>
@@ -1280,7 +1275,6 @@
         <w:rPr>
           <w:b/>
         </w:rPr>
-        <w:lastRenderedPageBreak/>
         <w:t>8.</w:t>
       </w:r>
       <w:r>
@@ -1404,118 +1398,142 @@
     </w:p>
     <w:p>
       <w:pPr>
-        <w:spacing w:after="0"/>
+        <w:spacing w:after="360"/>
       </w:pPr>
       <w:r>
         <w:t>Dated: September 4, 2026</w:t>
       </w:r>
     </w:p>
-    <w:p>
-      <w:pPr>
-        <w:spacing w:after="320"/>
-      </w:pPr>
-    </w:p>
-    <w:p>
-      <w:pPr>
-        <w:spacing w:after="0"/>
-      </w:pPr>
-      <w:r>
-        <w:t>____________________________________</w:t>
-      </w:r>
-    </w:p>
-    <w:p>
-      <w:pPr>
-        <w:spacing w:after="0"/>
-      </w:pPr>
-      <w:r>
-        <w:t>Yibiao Lu, Plaintiff pro se</w:t>
-      </w:r>
-    </w:p>
-    <w:p>
-      <w:pPr>
-        <w:spacing w:after="0"/>
-      </w:pPr>
-      <w:r>
-        <w:t>17756 George Moran Dr.</w:t>
-      </w:r>
-    </w:p>
-    <w:p>
-      <w:pPr>
-        <w:spacing w:after="0"/>
-      </w:pPr>
-      <w:r>
-        <w:t>Eden Prairie, MN 55347</w:t>
-      </w:r>
-    </w:p>
-    <w:p>
-      <w:pPr>
-        <w:spacing w:after="0"/>
-      </w:pPr>
-      <w:r>
-        <w:t>Telephone: 763-843-2859</w:t>
-      </w:r>
-    </w:p>
-    <w:p>
-      <w:pPr>
-        <w:spacing w:after="80"/>
-      </w:pPr>
-      <w:r>
-        <w:t>Email: bill_y_lu@yahoo.com</w:t>
-      </w:r>
-    </w:p>
-    <w:p>
-      <w:pPr>
-        <w:spacing w:after="320"/>
-      </w:pPr>
-    </w:p>
-    <w:p>
-      <w:pPr>
-        <w:spacing w:after="0"/>
-      </w:pPr>
-      <w:r>
-        <w:t>____________________________________</w:t>
-      </w:r>
-    </w:p>
-    <w:p>
-      <w:pPr>
-        <w:spacing w:after="0"/>
-      </w:pPr>
-      <w:r>
-        <w:t>Jie Hu, Plaintiff pro se</w:t>
-      </w:r>
-    </w:p>
-    <w:p>
-      <w:pPr>
-        <w:spacing w:after="0"/>
-      </w:pPr>
-      <w:r>
-        <w:t>17756 George Moran Dr.</w:t>
-      </w:r>
-    </w:p>
-    <w:p>
-      <w:pPr>
-        <w:spacing w:after="0"/>
-      </w:pPr>
-      <w:r>
-        <w:t>Eden Prairie, MN 55347</w:t>
-      </w:r>
-    </w:p>
-    <w:p>
-      <w:pPr>
-        <w:spacing w:after="0"/>
-      </w:pPr>
-      <w:r>
-        <w:t>Telephone: 763-843-2860</w:t>
-      </w:r>
-    </w:p>
-    <w:p>
-      <w:pPr>
-        <w:spacing w:after="80"/>
-      </w:pPr>
-      <w:r>
-        <w:t>Email: jie_h_hu@yahoo.com</w:t>
-      </w:r>
-    </w:p>
+    <w:tbl>
+      <w:tblPr>
+        <w:tblW w:w="0" w:type="auto"/>
+        <w:tblLayout w:type="fixed"/>
+        <w:tblLook w:val="04A0" w:firstRow="1" w:lastRow="0" w:firstColumn="1" w:lastColumn="0" w:noHBand="0" w:noVBand="1"/>
+      </w:tblPr>
+      <w:tblGrid>
+        <w:gridCol w:w="4680"/>
+        <w:gridCol w:w="4680"/>
+      </w:tblGrid>
+      <w:tr>
+        <w:tc>
+          <w:tcPr>
+            <w:tcW w:w="4680" w:type="dxa"/>
+          </w:tcPr>
+          <w:p>
+            <w:pPr>
+              <w:spacing w:after="0"/>
+            </w:pPr>
+          </w:p>
+          <w:p>
+            <w:pPr>
+              <w:spacing w:after="0"/>
+            </w:pPr>
+            <w:r>
+              <w:t>______________________________</w:t>
+            </w:r>
+          </w:p>
+          <w:p>
+            <w:pPr>
+              <w:spacing w:after="0"/>
+            </w:pPr>
+            <w:r>
+              <w:t>Yibiao Lu, Plaintiff pro se</w:t>
+            </w:r>
+          </w:p>
+          <w:p>
+            <w:pPr>
+              <w:spacing w:after="0"/>
+            </w:pPr>
+            <w:r>
+              <w:t>17756 George Moran Dr.</w:t>
+            </w:r>
+          </w:p>
+          <w:p>
+            <w:pPr>
+              <w:spacing w:after="0"/>
+            </w:pPr>
+            <w:r>
+              <w:t>Eden Prairie, MN 55347</w:t>
+            </w:r>
+          </w:p>
+          <w:p>
+            <w:pPr>
+              <w:spacing w:after="0"/>
+            </w:pPr>
+            <w:r>
+              <w:t>Telephone: 763-843-2859</w:t>
+            </w:r>
+          </w:p>
+          <w:p>
+            <w:pPr>
+              <w:spacing w:after="0"/>
+            </w:pPr>
+            <w:r>
+              <w:t>Email: bill_y_lu@yahoo.com</w:t>
+            </w:r>
+          </w:p>
+        </w:tc>
+        <w:tc>
+          <w:tcPr>
+            <w:tcW w:w="4680" w:type="dxa"/>
+          </w:tcPr>
+          <w:p>
+            <w:pPr>
+              <w:spacing w:after="0"/>
+            </w:pPr>
+          </w:p>
+          <w:p>
+            <w:pPr>
+              <w:spacing w:after="0"/>
+            </w:pPr>
+            <w:r>
+              <w:t>______________________________</w:t>
+            </w:r>
+          </w:p>
+          <w:p>
+            <w:pPr>
+              <w:spacing w:after="0"/>
+            </w:pPr>
+            <w:r>
+              <w:t>Jie Hu, Plaintiff pro se</w:t>
+            </w:r>
+          </w:p>
+          <w:p>
+            <w:pPr>
+              <w:spacing w:after="0"/>
+            </w:pPr>
+            <w:r>
+              <w:t>17756 George Moran Dr.</w:t>
+            </w:r>
+          </w:p>
+          <w:p>
+            <w:pPr>
+              <w:spacing w:after="0"/>
+            </w:pPr>
+            <w:r>
+              <w:t>Eden Prairie, MN 55347</w:t>
+            </w:r>
+          </w:p>
+          <w:p>
+            <w:pPr>
+              <w:spacing w:after="0"/>
+            </w:pPr>
+            <w:r>
+              <w:t>Telephone: 763-843-2860</w:t>
+            </w:r>
+          </w:p>
+          <w:p>
+            <w:pPr>
+              <w:spacing w:after="0"/>
+            </w:pPr>
+            <w:r>
+              <w:t>Email: jie_h_hu@yahoo.com</w:t>
+            </w:r>
+          </w:p>
+        </w:tc>
+      </w:tr>
+    </w:tbl>
+    <w:p/>
     <w:sectPr>
       <w:footerReference w:type="default" r:id="rId8"/>
       <w:footerReference w:type="first" r:id="rId9"/>

</xml_diff>

<commit_message>
Rename 2 notes header Note on Plaintiffs' shortening of their proposed schedule (was "Note on the trial-ready date proposed here") Note on the form of the trial-ready date (was "Note on the trial-ready date")
</commit_message>
<xml_diff>
--- a/Filings/Discovery/discoveryPlanAndInformationalStatement/Plaintiffs_Rule_26.06_Discovery_Plan_V5.docx
+++ b/Filings/Discovery/discoveryPlanAndInformationalStatement/Plaintiffs_Rule_26.06_Discovery_Plan_V5.docx
@@ -662,17 +662,17 @@
       <w:tblPr>
         <w:tblStyle w:val="TableGrid"/>
         <w:tblW w:w="0" w:type="auto"/>
-        <w:tblInd w:w="828" w:type="dxa"/>
+        <w:tblInd w:w="918" w:type="dxa"/>
         <w:tblLook w:val="04A0" w:firstRow="1" w:lastRow="0" w:firstColumn="1" w:lastColumn="0" w:noHBand="0" w:noVBand="1"/>
       </w:tblPr>
       <w:tblGrid>
-        <w:gridCol w:w="5508"/>
+        <w:gridCol w:w="5418"/>
         <w:gridCol w:w="3024"/>
       </w:tblGrid>
       <w:tr>
         <w:tc>
           <w:tcPr>
-            <w:tcW w:w="5508" w:type="dxa"/>
+            <w:tcW w:w="5418" w:type="dxa"/>
           </w:tcPr>
           <w:p>
             <w:pPr>
@@ -708,7 +708,7 @@
       <w:tr>
         <w:tc>
           <w:tcPr>
-            <w:tcW w:w="5508" w:type="dxa"/>
+            <w:tcW w:w="5418" w:type="dxa"/>
           </w:tcPr>
           <w:p>
             <w:pPr>
@@ -742,7 +742,7 @@
       <w:tr>
         <w:tc>
           <w:tcPr>
-            <w:tcW w:w="5508" w:type="dxa"/>
+            <w:tcW w:w="5418" w:type="dxa"/>
           </w:tcPr>
           <w:p>
             <w:pPr>
@@ -776,7 +776,7 @@
       <w:tr>
         <w:tc>
           <w:tcPr>
-            <w:tcW w:w="5508" w:type="dxa"/>
+            <w:tcW w:w="5418" w:type="dxa"/>
           </w:tcPr>
           <w:p>
             <w:pPr>
@@ -810,7 +810,7 @@
       <w:tr>
         <w:tc>
           <w:tcPr>
-            <w:tcW w:w="5508" w:type="dxa"/>
+            <w:tcW w:w="5418" w:type="dxa"/>
           </w:tcPr>
           <w:p>
             <w:pPr>
@@ -844,7 +844,7 @@
       <w:tr>
         <w:tc>
           <w:tcPr>
-            <w:tcW w:w="5508" w:type="dxa"/>
+            <w:tcW w:w="5418" w:type="dxa"/>
           </w:tcPr>
           <w:p>
             <w:pPr>
@@ -878,7 +878,7 @@
       <w:tr>
         <w:tc>
           <w:tcPr>
-            <w:tcW w:w="5508" w:type="dxa"/>
+            <w:tcW w:w="5418" w:type="dxa"/>
           </w:tcPr>
           <w:p>
             <w:pPr>
@@ -912,7 +912,7 @@
       <w:tr>
         <w:tc>
           <w:tcPr>
-            <w:tcW w:w="5508" w:type="dxa"/>
+            <w:tcW w:w="5418" w:type="dxa"/>
           </w:tcPr>
           <w:p>
             <w:pPr>
@@ -946,7 +946,7 @@
       <w:tr>
         <w:tc>
           <w:tcPr>
-            <w:tcW w:w="5508" w:type="dxa"/>
+            <w:tcW w:w="5418" w:type="dxa"/>
           </w:tcPr>
           <w:p>
             <w:pPr>
@@ -980,7 +980,7 @@
       <w:tr>
         <w:tc>
           <w:tcPr>
-            <w:tcW w:w="5508" w:type="dxa"/>
+            <w:tcW w:w="5418" w:type="dxa"/>
           </w:tcPr>
           <w:p>
             <w:pPr>
@@ -1014,7 +1014,7 @@
       <w:tr>
         <w:tc>
           <w:tcPr>
-            <w:tcW w:w="5508" w:type="dxa"/>
+            <w:tcW w:w="5418" w:type="dxa"/>
           </w:tcPr>
           <w:p>
             <w:pPr>
@@ -1048,7 +1048,7 @@
       <w:tr>
         <w:tc>
           <w:tcPr>
-            <w:tcW w:w="5508" w:type="dxa"/>
+            <w:tcW w:w="5418" w:type="dxa"/>
           </w:tcPr>
           <w:p>
             <w:pPr>
@@ -1082,7 +1082,7 @@
       <w:tr>
         <w:tc>
           <w:tcPr>
-            <w:tcW w:w="5508" w:type="dxa"/>
+            <w:tcW w:w="5418" w:type="dxa"/>
           </w:tcPr>
           <w:p>
             <w:pPr>
@@ -1116,7 +1116,7 @@
       <w:tr>
         <w:tc>
           <w:tcPr>
-            <w:tcW w:w="5508" w:type="dxa"/>
+            <w:tcW w:w="5418" w:type="dxa"/>
           </w:tcPr>
           <w:p>
             <w:pPr>
@@ -1162,14 +1162,14 @@
         <w:rPr>
           <w:b/>
         </w:rPr>
-        <w:t>Note on the trial-ready date proposed here.</w:t>
+        <w:t>Note on Plaintiffs' shortening of their proposed schedule.</w:t>
       </w:r>
       <w:r>
-        <w:t xml:space="preserve">  At the Rule 26.06 conference on August 28, 2026, Plaintiffs proposed a trial-ready date in June 2028. The schedule proposed above advances that date to May 15, 2028. Plaintiffs have shortened their own proposal by removing intervals that the work of this case does not require — principally by scheduling alternative dispute resolution after the exchange of expert reports rather than ahead of them, and by shortening each expert disclosure round to approximately one month. Plaintiffs have accordingly moved toward Defendant's position, and respectfully </w:t>
+        <w:t xml:space="preserve">  At the Rule 26.06 conference on August 28, 2026, Plaintiffs proposed a trial-ready date in June 2028. The schedule proposed above advances that date to May 15, 2028. Plaintiffs have shortened their own proposal by removing intervals that the work of this case does not require — principally by scheduling alternative dispute resolution after the exchange of expert reports rather than ahead of them, and by shortening each expert disclosure round to approximately one month. Plaintiffs have accordingly moved toward Defendant's </w:t>
       </w:r>
       <w:r>
         <w:lastRenderedPageBreak/>
-        <w:t>submit that the schedule above is the shortest one consistent with completing the discovery this case requires.</w:t>
+        <w:t>position, and respectfully submit that the schedule above is the shortest one consistent with completing the discovery this case requires.</w:t>
       </w:r>
     </w:p>
     <w:p>
@@ -1257,7 +1257,7 @@
           <w:b/>
         </w:rPr>
         <w:lastRenderedPageBreak/>
-        <w:t>Note on the trial-ready date.</w:t>
+        <w:t>Note on the form of the trial-ready date.</w:t>
       </w:r>
       <w:r>
         <w:t xml:space="preserve">  Plaintiffs propose a fixed trial-ready date rather than one expressed by reference to the determination of a dispositive motion. If a dispositive motion remains under advisement as the trial-ready date approaches, the parties will address the trial setting with the Court.</w:t>

</xml_diff>